<commit_message>
Update other certificates script with Y placeholder and role translations
https://claude.ai/code/session_01XbHfH1b8kg1rYEG4wXTtxY
</commit_message>
<xml_diff>
--- a/certificates/فوزية__بنت_محمد_العمري.docx
+++ b/certificates/فوزية__بنت_محمد_العمري.docx
@@ -15,15 +15,15 @@
         <mc:AlternateContent>
           <mc:Choice Requires="wps">
             <w:drawing>
-              <wp:anchor distT="0" distB="0" distL="114300" distR="114300" simplePos="0" relativeHeight="251666432" behindDoc="0" locked="0" layoutInCell="1" allowOverlap="1" wp14:anchorId="2D96A977" wp14:editId="640C75DF">
+              <wp:anchor distT="0" distB="0" distL="114300" distR="114300" simplePos="0" relativeHeight="251666432" behindDoc="0" locked="0" layoutInCell="1" allowOverlap="1" wp14:anchorId="2D96A977" wp14:editId="1ACFF360">
                 <wp:simplePos x="0" y="0"/>
                 <wp:positionH relativeFrom="margin">
-                  <wp:posOffset>-409575</wp:posOffset>
+                  <wp:posOffset>-405114</wp:posOffset>
                 </wp:positionH>
                 <wp:positionV relativeFrom="paragraph">
-                  <wp:posOffset>2283235</wp:posOffset>
+                  <wp:posOffset>2288331</wp:posOffset>
                 </wp:positionV>
-                <wp:extent cx="4824248" cy="3168869"/>
+                <wp:extent cx="4884517" cy="3168869"/>
                 <wp:effectExtent l="0" t="0" r="0" b="0"/>
                 <wp:wrapNone/>
                 <wp:docPr id="1102702226" name="Text Box 1"/>
@@ -35,7 +35,7 @@
                       <wps:spPr>
                         <a:xfrm>
                           <a:off x="0" y="0"/>
-                          <a:ext cx="4824248" cy="3168869"/>
+                          <a:ext cx="4884517" cy="3168869"/>
                         </a:xfrm>
                         <a:prstGeom prst="rect">
                           <a:avLst/>
@@ -128,7 +128,29 @@
                                 <w:szCs w:val="28"/>
                                 <w14:ligatures w14:val="none"/>
                               </w:rPr>
-                              <w:t>for her outstanding efforts in her role as Coordinator of Student Activities at the College of Computing and Informatics during the academic year 1447 AH</w:t>
+                              <w:t xml:space="preserve">for her outstanding efforts in her role as </w:t>
+                            </w:r>
+                            <w:r>
+                              <w:rPr>
+                                <w:rFonts w:ascii="Frutiger LT Arabic 45 Light" w:eastAsia="Times New Roman" w:hAnsi="Frutiger LT Arabic 45 Light" w:cs="Frutiger LT Arabic 45 Light"/>
+                                <w:color w:val="002060"/>
+                                <w:kern w:val="0"/>
+                                <w:sz w:val="28"/>
+                                <w:szCs w:val="28"/>
+                                <w14:ligatures w14:val="none"/>
+                              </w:rPr>
+                              <w:t>Coordinator of Student Activities</w:t>
+                            </w:r>
+                            <w:r>
+                              <w:rPr>
+                                <w:rFonts w:ascii="Frutiger LT Arabic 45 Light" w:eastAsia="Times New Roman" w:hAnsi="Frutiger LT Arabic 45 Light" w:cs="Frutiger LT Arabic 45 Light"/>
+                                <w:color w:val="002060"/>
+                                <w:kern w:val="0"/>
+                                <w:sz w:val="28"/>
+                                <w:szCs w:val="28"/>
+                                <w14:ligatures w14:val="none"/>
+                              </w:rPr>
+                              <w:t xml:space="preserve"> at the College of Computing and Informatics during the academic year 1447 AH</w:t>
                             </w:r>
                           </w:p>
                           <w:p>
@@ -181,7 +203,7 @@
                 <v:stroke joinstyle="miter"/>
                 <v:path gradientshapeok="t" o:connecttype="rect"/>
               </v:shapetype>
-              <v:shape id="Text Box 1" o:spid="_x0000_s1026" type="#_x0000_t202" style="position:absolute;left:0;text-align:left;margin-left:-32.25pt;margin-top:179.8pt;width:379.85pt;height:249.5pt;z-index:251666432;visibility:visible;mso-wrap-style:square;mso-width-percent:0;mso-height-percent:0;mso-wrap-distance-left:9pt;mso-wrap-distance-top:0;mso-wrap-distance-right:9pt;mso-wrap-distance-bottom:0;mso-position-horizontal:absolute;mso-position-horizontal-relative:margin;mso-position-vertical:absolute;mso-position-vertical-relative:text;mso-width-percent:0;mso-height-percent:0;mso-width-relative:margin;mso-height-relative:margin;v-text-anchor:top" o:gfxdata="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" filled="f" stroked="f" strokeweight=".5pt">
+              <v:shape id="Text Box 1" o:spid="_x0000_s1026" type="#_x0000_t202" style="position:absolute;left:0;text-align:left;margin-left:-31.9pt;margin-top:180.2pt;width:384.6pt;height:249.5pt;z-index:251666432;visibility:visible;mso-wrap-style:square;mso-width-percent:0;mso-height-percent:0;mso-wrap-distance-left:9pt;mso-wrap-distance-top:0;mso-wrap-distance-right:9pt;mso-wrap-distance-bottom:0;mso-position-horizontal:absolute;mso-position-horizontal-relative:margin;mso-position-vertical:absolute;mso-position-vertical-relative:text;mso-width-percent:0;mso-height-percent:0;mso-width-relative:margin;mso-height-relative:margin;v-text-anchor:top" o:gfxdata="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" filled="f" stroked="f" strokeweight=".5pt">
                 <v:textbox>
                   <w:txbxContent>
                     <w:p>
@@ -265,7 +287,29 @@
                           <w:szCs w:val="28"/>
                           <w14:ligatures w14:val="none"/>
                         </w:rPr>
-                        <w:t>for her outstanding efforts in her role as Coordinator of Student Activities at the College of Computing and Informatics during the academic year 1447 AH</w:t>
+                        <w:t xml:space="preserve">for her outstanding efforts in her role as </w:t>
+                      </w:r>
+                      <w:r>
+                        <w:rPr>
+                          <w:rFonts w:ascii="Frutiger LT Arabic 45 Light" w:eastAsia="Times New Roman" w:hAnsi="Frutiger LT Arabic 45 Light" w:cs="Frutiger LT Arabic 45 Light"/>
+                          <w:color w:val="002060"/>
+                          <w:kern w:val="0"/>
+                          <w:sz w:val="28"/>
+                          <w:szCs w:val="28"/>
+                          <w14:ligatures w14:val="none"/>
+                        </w:rPr>
+                        <w:t>Coordinator of Student Activities</w:t>
+                      </w:r>
+                      <w:r>
+                        <w:rPr>
+                          <w:rFonts w:ascii="Frutiger LT Arabic 45 Light" w:eastAsia="Times New Roman" w:hAnsi="Frutiger LT Arabic 45 Light" w:cs="Frutiger LT Arabic 45 Light"/>
+                          <w:color w:val="002060"/>
+                          <w:kern w:val="0"/>
+                          <w:sz w:val="28"/>
+                          <w:szCs w:val="28"/>
+                          <w14:ligatures w14:val="none"/>
+                        </w:rPr>
+                        <w:t xml:space="preserve"> at the College of Computing and Informatics during the academic year 1447 AH</w:t>
                       </w:r>
                     </w:p>
                     <w:p>
@@ -363,19 +407,7 @@
                                 <w:rtl/>
                                 <w14:ligatures w14:val="none"/>
                               </w:rPr>
-                              <w:t xml:space="preserve">يسر كلية الحوسبة والمعلوماتية بالجامعة السعودية </w:t>
-                            </w:r>
-                            <w:r>
-                              <w:rPr>
-                                <w:rFonts w:ascii="Frutiger LT Arabic 45 Light" w:eastAsia="Times New Roman" w:hAnsi="Frutiger LT Arabic 45 Light" w:cs="Frutiger LT Arabic 45 Light" w:hint="cs"/>
-                                <w:color w:val="156082" w:themeColor="accent1"/>
-                                <w:kern w:val="0"/>
-                                <w:sz w:val="28"/>
-                                <w:szCs w:val="28"/>
-                                <w:rtl/>
-                                <w14:ligatures w14:val="none"/>
-                              </w:rPr>
-                              <w:t>ال</w:t>
+                              <w:t>يسر كلية الحوسبة والمعلوماتية بالجامعة السعودية ال</w:t>
                             </w:r>
                             <w:r>
                               <w:rPr>
@@ -443,19 +475,6 @@
                                 <w14:ligatures w14:val="none"/>
                               </w:rPr>
                             </w:pPr>
-                            <w:proofErr w:type="gramStart"/>
-                            <w:r>
-                              <w:rPr>
-                                <w:rFonts w:ascii="Frutiger LT Arabic 45 Light" w:eastAsia="Times New Roman" w:hAnsi="Frutiger LT Arabic 45 Light" w:cs="Frutiger LT Arabic 45 Light" w:hint="cs"/>
-                                <w:color w:val="156082" w:themeColor="accent1"/>
-                                <w:kern w:val="0"/>
-                                <w:sz w:val="28"/>
-                                <w:szCs w:val="28"/>
-                                <w:rtl/>
-                                <w14:ligatures w14:val="none"/>
-                              </w:rPr>
-                              <w:t>ل</w:t>
-                            </w:r>
                             <w:r>
                               <w:rPr>
                                 <w:rFonts w:ascii="Frutiger LT Arabic 45 Light" w:eastAsia="Times New Roman" w:hAnsi="Frutiger LT Arabic 45 Light" w:cs="Frutiger LT Arabic 45 Light"/>
@@ -465,9 +484,8 @@
                                 <w:szCs w:val="28"/>
                                 <w14:ligatures w14:val="none"/>
                               </w:rPr>
-                              <w:t>المحاضرة</w:t>
-                            </w:r>
-                            <w:proofErr w:type="gramEnd"/>
+                              <w:t>للمحاضرة</w:t>
+                            </w:r>
                             <w:r>
                               <w:rPr>
                                 <w:rFonts w:ascii="Frutiger LT Arabic 45 Light" w:eastAsia="Times New Roman" w:hAnsi="Frutiger LT Arabic 45 Light" w:cs="Frutiger LT Arabic 45 Light" w:hint="cs"/>
@@ -714,7 +732,11 @@
           </mc:Choice>
           <mc:Fallback>
             <w:pict>
-              <v:shape w14:anchorId="4BEF5500" id="_x0000_s1027" type="#_x0000_t202" style="position:absolute;left:0;text-align:left;margin-left:358.75pt;margin-top:175.25pt;width:373.6pt;height:249.5pt;z-index:251664384;visibility:visible;mso-wrap-style:square;mso-width-percent:0;mso-height-percent:0;mso-wrap-distance-left:9pt;mso-wrap-distance-top:0;mso-wrap-distance-right:9pt;mso-wrap-distance-bottom:0;mso-position-horizontal:absolute;mso-position-horizontal-relative:margin;mso-position-vertical:absolute;mso-position-vertical-relative:text;mso-width-percent:0;mso-height-percent:0;mso-width-relative:margin;mso-height-relative:margin;v-text-anchor:top" o:gfxdata="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" filled="f" stroked="f" strokeweight=".5pt">
+              <v:shapetype w14:anchorId="4BEF5500" id="_x0000_t202" coordsize="21600,21600" o:spt="202" path="m,l,21600r21600,l21600,xe">
+                <v:stroke joinstyle="miter"/>
+                <v:path gradientshapeok="t" o:connecttype="rect"/>
+              </v:shapetype>
+              <v:shape id="_x0000_s1027" type="#_x0000_t202" style="position:absolute;left:0;text-align:left;margin-left:358.75pt;margin-top:175.25pt;width:373.6pt;height:249.5pt;z-index:251664384;visibility:visible;mso-wrap-style:square;mso-width-percent:0;mso-height-percent:0;mso-wrap-distance-left:9pt;mso-wrap-distance-top:0;mso-wrap-distance-right:9pt;mso-wrap-distance-bottom:0;mso-position-horizontal:absolute;mso-position-horizontal-relative:margin;mso-position-vertical:absolute;mso-position-vertical-relative:text;mso-width-percent:0;mso-height-percent:0;mso-width-relative:margin;mso-height-relative:margin;v-text-anchor:top" o:gfxdata="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" filled="f" stroked="f" strokeweight=".5pt">
                 <v:textbox>
                   <w:txbxContent>
                     <w:p>
@@ -741,19 +763,7 @@
                           <w:rtl/>
                           <w14:ligatures w14:val="none"/>
                         </w:rPr>
-                        <w:t xml:space="preserve">يسر كلية الحوسبة والمعلوماتية بالجامعة السعودية </w:t>
-                      </w:r>
-                      <w:r>
-                        <w:rPr>
-                          <w:rFonts w:ascii="Frutiger LT Arabic 45 Light" w:eastAsia="Times New Roman" w:hAnsi="Frutiger LT Arabic 45 Light" w:cs="Frutiger LT Arabic 45 Light" w:hint="cs"/>
-                          <w:color w:val="156082" w:themeColor="accent1"/>
-                          <w:kern w:val="0"/>
-                          <w:sz w:val="28"/>
-                          <w:szCs w:val="28"/>
-                          <w:rtl/>
-                          <w14:ligatures w14:val="none"/>
-                        </w:rPr>
-                        <w:t>ال</w:t>
+                        <w:t>يسر كلية الحوسبة والمعلوماتية بالجامعة السعودية ال</w:t>
                       </w:r>
                       <w:r>
                         <w:rPr>
@@ -821,19 +831,6 @@
                           <w14:ligatures w14:val="none"/>
                         </w:rPr>
                       </w:pPr>
-                      <w:proofErr w:type="gramStart"/>
-                      <w:r>
-                        <w:rPr>
-                          <w:rFonts w:ascii="Frutiger LT Arabic 45 Light" w:eastAsia="Times New Roman" w:hAnsi="Frutiger LT Arabic 45 Light" w:cs="Frutiger LT Arabic 45 Light" w:hint="cs"/>
-                          <w:color w:val="156082" w:themeColor="accent1"/>
-                          <w:kern w:val="0"/>
-                          <w:sz w:val="28"/>
-                          <w:szCs w:val="28"/>
-                          <w:rtl/>
-                          <w14:ligatures w14:val="none"/>
-                        </w:rPr>
-                        <w:t>ل</w:t>
-                      </w:r>
                       <w:r>
                         <w:rPr>
                           <w:rFonts w:ascii="Frutiger LT Arabic 45 Light" w:eastAsia="Times New Roman" w:hAnsi="Frutiger LT Arabic 45 Light" w:cs="Frutiger LT Arabic 45 Light"/>
@@ -843,9 +840,8 @@
                           <w:szCs w:val="28"/>
                           <w14:ligatures w14:val="none"/>
                         </w:rPr>
-                        <w:t>المحاضرة</w:t>
-                      </w:r>
-                      <w:proofErr w:type="gramEnd"/>
+                        <w:t>للمحاضرة</w:t>
+                      </w:r>
                       <w:r>
                         <w:rPr>
                           <w:rFonts w:ascii="Frutiger LT Arabic 45 Light" w:eastAsia="Times New Roman" w:hAnsi="Frutiger LT Arabic 45 Light" w:cs="Frutiger LT Arabic 45 Light" w:hint="cs"/>
@@ -1787,7 +1783,7 @@
                                     <pic:cNvPicPr/>
                                   </pic:nvPicPr>
                                   <pic:blipFill>
-                                    <a:blip r:embed="rId6" cstate="print"/>
+                                    <a:blip r:embed="rId7" cstate="print"/>
                                     <a:stretch>
                                       <a:fillRect/>
                                     </a:stretch>
@@ -2747,7 +2743,7 @@
                     <pic:cNvPicPr/>
                   </pic:nvPicPr>
                   <pic:blipFill>
-                    <a:blip r:embed="rId7">
+                    <a:blip r:embed="rId8">
                       <a:extLst>
                         <a:ext uri="{28A0092B-C50C-407E-A947-70E740481C1C}">
                           <a14:useLocalDpi xmlns:a14="http://schemas.microsoft.com/office/drawing/2010/main" val="0"/>
@@ -2784,9 +2780,9 @@
       </w:r>
     </w:p>
     <w:sectPr>
-      <w:footerReference w:type="even" r:id="rId8"/>
-      <w:footerReference w:type="default" r:id="rId9"/>
-      <w:footerReference w:type="first" r:id="rId10"/>
+      <w:footerReference w:type="even" r:id="rId9"/>
+      <w:footerReference w:type="default" r:id="rId10"/>
+      <w:footerReference w:type="first" r:id="rId11"/>
       <w:pgSz w:w="16838" w:h="11906" w:orient="landscape"/>
       <w:pgMar w:top="370" w:right="1440" w:bottom="367" w:left="1440" w:header="720" w:footer="720" w:gutter="0"/>
       <w:cols w:space="720"/>
@@ -3725,6 +3721,7 @@
   <w:style w:type="character" w:default="1" w:styleId="DefaultParagraphFont">
     <w:name w:val="Default Paragraph Font"/>
     <w:uiPriority w:val="1"/>
+    <w:semiHidden/>
     <w:unhideWhenUsed/>
   </w:style>
   <w:style w:type="table" w:default="1" w:styleId="TableNormal">

</xml_diff>

<commit_message>
Update other certificates script with new file paths and expanded role translations
https://claude.ai/code/session_01XbHfH1b8kg1rYEG4wXTtxY
</commit_message>
<xml_diff>
--- a/certificates/فوزية__بنت_محمد_العمري.docx
+++ b/certificates/فوزية__بنت_محمد_العمري.docx
@@ -139,7 +139,7 @@
                                 <w:szCs w:val="28"/>
                                 <w14:ligatures w14:val="none"/>
                               </w:rPr>
-                              <w:t>Coordinator of Student Activities</w:t>
+                              <w:t>Academic Advising and Supervision Committee</w:t>
                             </w:r>
                             <w:r>
                               <w:rPr>
@@ -298,7 +298,7 @@
                           <w:szCs w:val="28"/>
                           <w14:ligatures w14:val="none"/>
                         </w:rPr>
-                        <w:t>Coordinator of Student Activities</w:t>
+                        <w:t>Academic Advising and Supervision Committee</w:t>
                       </w:r>
                       <w:r>
                         <w:rPr>
@@ -570,18 +570,6 @@
                                 <w:rtl/>
                                 <w14:ligatures w14:val="none"/>
                               </w:rPr>
-                              <w:t/>
-                            </w:r>
-                            <w:r>
-                              <w:rPr>
-                                <w:rFonts w:ascii="Frutiger LT Arabic 45 Light" w:eastAsia="Times New Roman" w:hAnsi="Frutiger LT Arabic 45 Light" w:cs="Frutiger LT Arabic 45 Light" w:hint="cs"/>
-                                <w:color w:val="156082" w:themeColor="accent1"/>
-                                <w:kern w:val="0"/>
-                                <w:sz w:val="28"/>
-                                <w:szCs w:val="28"/>
-                                <w:rtl/>
-                                <w14:ligatures w14:val="none"/>
-                              </w:rPr>
                               <w:t xml:space="preserve"> </w:t>
                             </w:r>
                             <w:r>
@@ -593,7 +581,7 @@
                                 <w:szCs w:val="28"/>
                                 <w14:ligatures w14:val="none"/>
                               </w:rPr>
-                              <w:t>كمنسقة الأنشطة الطلابية</w:t>
+                              <w:t>كلجنة الإرشاد والإشراف الدراسي</w:t>
                             </w:r>
                             <w:r>
                               <w:rPr>
@@ -926,18 +914,6 @@
                           <w:rtl/>
                           <w14:ligatures w14:val="none"/>
                         </w:rPr>
-                        <w:t/>
-                      </w:r>
-                      <w:r>
-                        <w:rPr>
-                          <w:rFonts w:ascii="Frutiger LT Arabic 45 Light" w:eastAsia="Times New Roman" w:hAnsi="Frutiger LT Arabic 45 Light" w:cs="Frutiger LT Arabic 45 Light" w:hint="cs"/>
-                          <w:color w:val="156082" w:themeColor="accent1"/>
-                          <w:kern w:val="0"/>
-                          <w:sz w:val="28"/>
-                          <w:szCs w:val="28"/>
-                          <w:rtl/>
-                          <w14:ligatures w14:val="none"/>
-                        </w:rPr>
                         <w:t xml:space="preserve"> </w:t>
                       </w:r>
                       <w:r>
@@ -949,7 +925,7 @@
                           <w:szCs w:val="28"/>
                           <w14:ligatures w14:val="none"/>
                         </w:rPr>
-                        <w:t>كمنسقة الأنشطة الطلابية</w:t>
+                        <w:t>كلجنة الإرشاد والإشراف الدراسي</w:t>
                       </w:r>
                       <w:r>
                         <w:rPr>

</xml_diff>